<commit_message>
Edit resume, add minjava page
</commit_message>
<xml_diff>
--- a/public/resume/Monserate Resume.docx
+++ b/public/resume/Monserate Resume.docx
@@ -1,6 +1,6 @@
 
 <file path=word/document.xml><?xml version="1.0" encoding="utf-8"?>
-<w:document xmlns:wpc="http://schemas.microsoft.com/office/word/2010/wordprocessingCanvas" xmlns:cx="http://schemas.microsoft.com/office/drawing/2014/chartex" xmlns:cx1="http://schemas.microsoft.com/office/drawing/2015/9/8/chartex" xmlns:cx2="http://schemas.microsoft.com/office/drawing/2015/10/21/chartex" xmlns:cx3="http://schemas.microsoft.com/office/drawing/2016/5/9/chartex" xmlns:cx4="http://schemas.microsoft.com/office/drawing/2016/5/10/chartex" xmlns:cx5="http://schemas.microsoft.com/office/drawing/2016/5/11/chartex" xmlns:cx6="http://schemas.microsoft.com/office/drawing/2016/5/12/chartex" xmlns:cx7="http://schemas.microsoft.com/office/drawing/2016/5/13/chartex" xmlns:cx8="http://schemas.microsoft.com/office/drawing/2016/5/14/chartex" xmlns:mc="http://schemas.openxmlformats.org/markup-compatibility/2006" xmlns:aink="http://schemas.microsoft.com/office/drawing/2016/ink" xmlns:am3d="http://schemas.microsoft.com/office/drawing/2017/model3d" xmlns:o="urn:schemas-microsoft-com:office:office" xmlns:oel="http://schemas.microsoft.com/office/2019/extlst" xmlns:r="http://schemas.openxmlformats.org/officeDocument/2006/relationships" xmlns:m="http://schemas.openxmlformats.org/officeDocument/2006/math" xmlns:v="urn:schemas-microsoft-com:vml" xmlns:wp14="http://schemas.microsoft.com/office/word/2010/wordprocessingDrawing" xmlns:wp="http://schemas.openxmlformats.org/drawingml/2006/wordprocessingDrawing" xmlns:w10="urn:schemas-microsoft-com:office:word" xmlns:w="http://schemas.openxmlformats.org/wordprocessingml/2006/main" xmlns:w14="http://schemas.microsoft.com/office/word/2010/wordml" xmlns:w15="http://schemas.microsoft.com/office/word/2012/wordml" xmlns:w16cex="http://schemas.microsoft.com/office/word/2018/wordml/cex" xmlns:w16cid="http://schemas.microsoft.com/office/word/2016/wordml/cid" xmlns:w16="http://schemas.microsoft.com/office/word/2018/wordml" xmlns:w16sdtdh="http://schemas.microsoft.com/office/word/2020/wordml/sdtdatahash" xmlns:w16se="http://schemas.microsoft.com/office/word/2015/wordml/symex" xmlns:wpg="http://schemas.microsoft.com/office/word/2010/wordprocessingGroup" xmlns:wpi="http://schemas.microsoft.com/office/word/2010/wordprocessingInk" xmlns:wne="http://schemas.microsoft.com/office/word/2006/wordml" xmlns:wps="http://schemas.microsoft.com/office/word/2010/wordprocessingShape" mc:Ignorable="w14 w15 w16se w16cid w16 w16cex w16sdtdh wp14">
+<w:document xmlns:wpc="http://schemas.microsoft.com/office/word/2010/wordprocessingCanvas" xmlns:cx="http://schemas.microsoft.com/office/drawing/2014/chartex" xmlns:cx1="http://schemas.microsoft.com/office/drawing/2015/9/8/chartex" xmlns:cx2="http://schemas.microsoft.com/office/drawing/2015/10/21/chartex" xmlns:cx3="http://schemas.microsoft.com/office/drawing/2016/5/9/chartex" xmlns:cx4="http://schemas.microsoft.com/office/drawing/2016/5/10/chartex" xmlns:cx5="http://schemas.microsoft.com/office/drawing/2016/5/11/chartex" xmlns:cx6="http://schemas.microsoft.com/office/drawing/2016/5/12/chartex" xmlns:cx7="http://schemas.microsoft.com/office/drawing/2016/5/13/chartex" xmlns:cx8="http://schemas.microsoft.com/office/drawing/2016/5/14/chartex" xmlns:mc="http://schemas.openxmlformats.org/markup-compatibility/2006" xmlns:aink="http://schemas.microsoft.com/office/drawing/2016/ink" xmlns:am3d="http://schemas.microsoft.com/office/drawing/2017/model3d" xmlns:o="urn:schemas-microsoft-com:office:office" xmlns:oel="http://schemas.microsoft.com/office/2019/extlst" xmlns:r="http://schemas.openxmlformats.org/officeDocument/2006/relationships" xmlns:m="http://schemas.openxmlformats.org/officeDocument/2006/math" xmlns:v="urn:schemas-microsoft-com:vml" xmlns:wp14="http://schemas.microsoft.com/office/word/2010/wordprocessingDrawing" xmlns:wp="http://schemas.openxmlformats.org/drawingml/2006/wordprocessingDrawing" xmlns:w10="urn:schemas-microsoft-com:office:word" xmlns:w="http://schemas.openxmlformats.org/wordprocessingml/2006/main" xmlns:w14="http://schemas.microsoft.com/office/word/2010/wordml" xmlns:w15="http://schemas.microsoft.com/office/word/2012/wordml" xmlns:w16cei="http://schemas.microsoft.com/office/word/2026/wordml/cei" xmlns:w16cex="http://schemas.microsoft.com/office/word/2018/wordml/cex" xmlns:w16cid="http://schemas.microsoft.com/office/word/2016/wordml/cid" xmlns:w16="http://schemas.microsoft.com/office/word/2018/wordml" xmlns:w16du="http://schemas.microsoft.com/office/word/2023/wordml/word16du" xmlns:w16sdtdh="http://schemas.microsoft.com/office/word/2020/wordml/sdtdatahash" xmlns:w16sdtfl="http://schemas.microsoft.com/office/word/2024/wordml/sdtformatlock" xmlns:w16se="http://schemas.microsoft.com/office/word/2015/wordml/symex" xmlns:wpg="http://schemas.microsoft.com/office/word/2010/wordprocessingGroup" xmlns:wpi="http://schemas.microsoft.com/office/word/2010/wordprocessingInk" xmlns:wne="http://schemas.microsoft.com/office/word/2006/wordml" xmlns:wps="http://schemas.microsoft.com/office/word/2010/wordprocessingShape" mc:Ignorable="w14 w15 w16se w16cid w16 w16cex w16sdtdh w16sdtfl w16du wp14">
   <w:body>
     <w:p>
       <w:pPr>
@@ -22,9 +22,8 @@
           <w:szCs w:val="38"/>
           <w:lang w:val="en-US"/>
         </w:rPr>
-        <w:t xml:space="preserve">Violet </w:t>
-      </w:r>
-      <w:proofErr w:type="spellStart"/>
+        <w:t>Violet</w:t>
+      </w:r>
       <w:r>
         <w:rPr>
           <w:rFonts w:ascii="Barlow" w:eastAsia="Times New Roman" w:hAnsi="Barlow" w:cs="Times New Roman"/>
@@ -35,9 +34,8 @@
           <w:szCs w:val="38"/>
           <w:lang w:val="en-US"/>
         </w:rPr>
-        <w:t>Monserate</w:t>
-      </w:r>
-      <w:proofErr w:type="spellEnd"/>
+        <w:t xml:space="preserve"> Monserate</w:t>
+      </w:r>
     </w:p>
     <w:p>
       <w:pPr>
@@ -1163,7 +1161,6 @@
         </w:rPr>
         <w:t xml:space="preserve">thics, </w:t>
       </w:r>
-      <w:proofErr w:type="spellStart"/>
       <w:r>
         <w:rPr>
           <w:rFonts w:ascii="Barlow" w:eastAsia="Times New Roman" w:hAnsi="Barlow" w:cs="Times New Roman"/>
@@ -1184,7 +1181,6 @@
         </w:rPr>
         <w:t>euroethics</w:t>
       </w:r>
-      <w:proofErr w:type="spellEnd"/>
       <w:r>
         <w:rPr>
           <w:rFonts w:ascii="Barlow" w:eastAsia="Times New Roman" w:hAnsi="Barlow" w:cs="Times New Roman"/>
@@ -1224,150 +1220,6 @@
           <w:lang w:val="en-US"/>
         </w:rPr>
         <w:t>hildren</w:t>
-      </w:r>
-    </w:p>
-    <w:p>
-      <w:pPr>
-        <w:spacing w:after="80" w:line="259" w:lineRule="auto"/>
-        <w:rPr>
-          <w:rFonts w:ascii="Times New Roman" w:eastAsia="Times New Roman" w:hAnsi="Times New Roman" w:cs="Times New Roman"/>
-          <w:sz w:val="24"/>
-          <w:szCs w:val="24"/>
-          <w:lang w:val="en-US"/>
-        </w:rPr>
-      </w:pPr>
-      <w:proofErr w:type="spellStart"/>
-      <w:r>
-        <w:rPr>
-          <w:rFonts w:ascii="Barlow" w:eastAsia="Times New Roman" w:hAnsi="Barlow" w:cs="Times New Roman"/>
-          <w:b/>
-          <w:bCs/>
-          <w:color w:val="000000"/>
-          <w:sz w:val="21"/>
-          <w:szCs w:val="21"/>
-          <w:lang w:val="en-US"/>
-        </w:rPr>
-        <w:t>Raisbeck</w:t>
-      </w:r>
-      <w:proofErr w:type="spellEnd"/>
-      <w:r>
-        <w:rPr>
-          <w:rFonts w:ascii="Barlow" w:eastAsia="Times New Roman" w:hAnsi="Barlow" w:cs="Times New Roman"/>
-          <w:b/>
-          <w:bCs/>
-          <w:color w:val="000000"/>
-          <w:sz w:val="21"/>
-          <w:szCs w:val="21"/>
-          <w:lang w:val="en-US"/>
-        </w:rPr>
-        <w:t xml:space="preserve"> Aviation High School</w:t>
-      </w:r>
-      <w:r>
-        <w:rPr>
-          <w:rFonts w:ascii="Barlow" w:eastAsia="Times New Roman" w:hAnsi="Barlow" w:cs="Times New Roman"/>
-          <w:color w:val="000000"/>
-          <w:sz w:val="21"/>
-          <w:szCs w:val="21"/>
-          <w:lang w:val="en-US"/>
-        </w:rPr>
-        <w:t xml:space="preserve">, High School Diploma | </w:t>
-      </w:r>
-      <w:r>
-        <w:rPr>
-          <w:rFonts w:ascii="Barlow" w:eastAsia="Times New Roman" w:hAnsi="Barlow" w:cs="Times New Roman"/>
-          <w:b/>
-          <w:bCs/>
-          <w:color w:val="000000"/>
-          <w:sz w:val="21"/>
-          <w:szCs w:val="21"/>
-          <w:lang w:val="en-US"/>
-        </w:rPr>
-        <w:t>4.0 GPA</w:t>
-      </w:r>
-      <w:r>
-        <w:rPr>
-          <w:rFonts w:ascii="Barlow" w:eastAsia="Times New Roman" w:hAnsi="Barlow" w:cs="Times New Roman"/>
-          <w:b/>
-          <w:bCs/>
-          <w:color w:val="000000"/>
-          <w:sz w:val="21"/>
-          <w:szCs w:val="21"/>
-          <w:lang w:val="en-US"/>
-        </w:rPr>
-        <w:tab/>
-      </w:r>
-      <w:r>
-        <w:rPr>
-          <w:rFonts w:ascii="Barlow" w:eastAsia="Times New Roman" w:hAnsi="Barlow" w:cs="Times New Roman"/>
-          <w:b/>
-          <w:bCs/>
-          <w:color w:val="000000"/>
-          <w:sz w:val="21"/>
-          <w:szCs w:val="21"/>
-          <w:lang w:val="en-US"/>
-        </w:rPr>
-        <w:tab/>
-      </w:r>
-      <w:r>
-        <w:rPr>
-          <w:rFonts w:ascii="Barlow" w:eastAsia="Times New Roman" w:hAnsi="Barlow" w:cs="Times New Roman"/>
-          <w:b/>
-          <w:bCs/>
-          <w:color w:val="000000"/>
-          <w:sz w:val="21"/>
-          <w:szCs w:val="21"/>
-          <w:lang w:val="en-US"/>
-        </w:rPr>
-        <w:tab/>
-      </w:r>
-      <w:r>
-        <w:rPr>
-          <w:rFonts w:ascii="Barlow" w:eastAsia="Times New Roman" w:hAnsi="Barlow" w:cs="Times New Roman"/>
-          <w:b/>
-          <w:bCs/>
-          <w:color w:val="000000"/>
-          <w:sz w:val="21"/>
-          <w:szCs w:val="21"/>
-          <w:lang w:val="en-US"/>
-        </w:rPr>
-        <w:tab/>
-      </w:r>
-      <w:r>
-        <w:rPr>
-          <w:rFonts w:ascii="Barlow" w:eastAsia="Times New Roman" w:hAnsi="Barlow" w:cs="Times New Roman"/>
-          <w:b/>
-          <w:bCs/>
-          <w:color w:val="000000"/>
-          <w:sz w:val="21"/>
-          <w:szCs w:val="21"/>
-          <w:lang w:val="en-US"/>
-        </w:rPr>
-        <w:tab/>
-      </w:r>
-      <w:r>
-        <w:rPr>
-          <w:rFonts w:ascii="Barlow" w:eastAsia="Times New Roman" w:hAnsi="Barlow" w:cs="Times New Roman"/>
-          <w:b/>
-          <w:bCs/>
-          <w:color w:val="000000"/>
-          <w:sz w:val="21"/>
-          <w:szCs w:val="21"/>
-          <w:lang w:val="en-US"/>
-        </w:rPr>
-        <w:tab/>
-        <w:t xml:space="preserve">      </w:t>
-      </w:r>
-      <w:r>
-        <w:rPr>
-          <w:rFonts w:ascii="Barlow" w:eastAsia="Times New Roman" w:hAnsi="Barlow" w:cs="Times New Roman"/>
-          <w:i/>
-          <w:iCs/>
-          <w:color w:val="000000"/>
-          <w:sz w:val="21"/>
-          <w:szCs w:val="21"/>
-          <w:lang w:val="en-US"/>
-        </w:rPr>
-        <w:t>09/19 - 06/23</w:t>
       </w:r>
     </w:p>
     <w:p>
@@ -1695,9 +1547,8 @@
           <w:color w:val="000000"/>
           <w:sz w:val="21"/>
           <w:szCs w:val="21"/>
-          <w:lang w:val="en-US"/>
-        </w:rPr>
-        <w:t>Automatic Museum Guide</w:t>
+        </w:rPr>
+        <w:t>Assistive Museum Headphones</w:t>
       </w:r>
       <w:r>
         <w:rPr>
@@ -1717,17 +1568,7 @@
           <w:szCs w:val="21"/>
           <w:lang w:val="en-US"/>
         </w:rPr>
-        <w:t xml:space="preserve">Python, C++, STM32 Ecosystem, </w:t>
-      </w:r>
-      <w:r>
-        <w:rPr>
-          <w:rFonts w:ascii="Barlow" w:eastAsia="Times New Roman" w:hAnsi="Barlow" w:cs="Times New Roman"/>
-          <w:color w:val="000000"/>
-          <w:sz w:val="21"/>
-          <w:szCs w:val="21"/>
-          <w:lang w:val="en-US"/>
-        </w:rPr>
-        <w:t>Git</w:t>
+        <w:t>Python, C++, STM32 Ecosystem, Git</w:t>
       </w:r>
       <w:r>
         <w:rPr>
@@ -1899,25 +1740,14 @@
         </w:rPr>
         <w:t xml:space="preserve">using </w:t>
       </w:r>
-      <w:proofErr w:type="spellStart"/>
-      <w:r>
-        <w:rPr>
-          <w:rFonts w:ascii="Barlow" w:eastAsia="Times New Roman" w:hAnsi="Barlow" w:cs="Times New Roman"/>
-          <w:color w:val="000000"/>
-          <w:sz w:val="21"/>
-          <w:szCs w:val="21"/>
-        </w:rPr>
-        <w:t>FreeRTOS</w:t>
-      </w:r>
-      <w:proofErr w:type="spellEnd"/>
-      <w:r>
-        <w:rPr>
-          <w:rFonts w:ascii="Barlow" w:eastAsia="Times New Roman" w:hAnsi="Barlow" w:cs="Times New Roman"/>
-          <w:color w:val="000000"/>
-          <w:sz w:val="21"/>
-          <w:szCs w:val="21"/>
-        </w:rPr>
-        <w:t xml:space="preserve"> to manage I2S audio </w:t>
+      <w:r>
+        <w:rPr>
+          <w:rFonts w:ascii="Barlow" w:eastAsia="Times New Roman" w:hAnsi="Barlow" w:cs="Times New Roman"/>
+          <w:color w:val="000000"/>
+          <w:sz w:val="21"/>
+          <w:szCs w:val="21"/>
+        </w:rPr>
+        <w:t xml:space="preserve">FreeRTOS to manage I2S audio </w:t>
       </w:r>
       <w:r>
         <w:rPr>
@@ -1978,29 +1808,7 @@
           <w:szCs w:val="21"/>
           <w:lang w:val="en-US"/>
         </w:rPr>
-        <w:t xml:space="preserve">, React, </w:t>
-      </w:r>
-      <w:proofErr w:type="spellStart"/>
-      <w:r>
-        <w:rPr>
-          <w:rFonts w:ascii="Barlow" w:eastAsia="Times New Roman" w:hAnsi="Barlow" w:cs="Times New Roman"/>
-          <w:color w:val="000000"/>
-          <w:sz w:val="21"/>
-          <w:szCs w:val="21"/>
-          <w:lang w:val="en-US"/>
-        </w:rPr>
-        <w:t>Vite</w:t>
-      </w:r>
-      <w:proofErr w:type="spellEnd"/>
-      <w:r>
-        <w:rPr>
-          <w:rFonts w:ascii="Barlow" w:eastAsia="Times New Roman" w:hAnsi="Barlow" w:cs="Times New Roman"/>
-          <w:color w:val="000000"/>
-          <w:sz w:val="21"/>
-          <w:szCs w:val="21"/>
-          <w:lang w:val="en-US"/>
-        </w:rPr>
-        <w:t>, Cesium, C++</w:t>
+        <w:t>, React, Vite, Cesium, C++</w:t>
       </w:r>
       <w:r>
         <w:rPr>
@@ -2165,29 +1973,7 @@
           <w:szCs w:val="21"/>
           <w:lang w:val="en-US"/>
         </w:rPr>
-        <w:t xml:space="preserve">Develop back-end server to deliver </w:t>
-      </w:r>
-      <w:proofErr w:type="spellStart"/>
-      <w:r>
-        <w:rPr>
-          <w:rFonts w:ascii="Barlow" w:eastAsia="Times New Roman" w:hAnsi="Barlow" w:cs="Times New Roman"/>
-          <w:color w:val="000000"/>
-          <w:sz w:val="21"/>
-          <w:szCs w:val="21"/>
-          <w:lang w:val="en-US"/>
-        </w:rPr>
-        <w:t>glTF</w:t>
-      </w:r>
-      <w:proofErr w:type="spellEnd"/>
-      <w:r>
-        <w:rPr>
-          <w:rFonts w:ascii="Barlow" w:eastAsia="Times New Roman" w:hAnsi="Barlow" w:cs="Times New Roman"/>
-          <w:color w:val="000000"/>
-          <w:sz w:val="21"/>
-          <w:szCs w:val="21"/>
-          <w:lang w:val="en-US"/>
-        </w:rPr>
-        <w:t xml:space="preserve"> tiles with a RESTful URI to operate without an internet connection</w:t>
+        <w:t>Develop back-end server to deliver glTF tiles with a RESTful URI to operate without an internet connection</w:t>
       </w:r>
     </w:p>
     <w:p>
@@ -2261,27 +2047,15 @@
         </w:rPr>
         <w:t xml:space="preserve">, </w:t>
       </w:r>
-      <w:proofErr w:type="spellStart"/>
-      <w:r>
-        <w:rPr>
-          <w:rFonts w:ascii="Barlow" w:eastAsia="Times New Roman" w:hAnsi="Barlow" w:cs="Times New Roman"/>
-          <w:color w:val="000000"/>
-          <w:sz w:val="21"/>
-          <w:szCs w:val="21"/>
-          <w:lang w:val="en-US"/>
-        </w:rPr>
-        <w:t>Onshape</w:t>
-      </w:r>
-      <w:proofErr w:type="spellEnd"/>
-      <w:r>
-        <w:rPr>
-          <w:rFonts w:ascii="Barlow" w:eastAsia="Times New Roman" w:hAnsi="Barlow" w:cs="Times New Roman"/>
-          <w:color w:val="000000"/>
-          <w:sz w:val="21"/>
-          <w:szCs w:val="21"/>
-          <w:lang w:val="en-US"/>
-        </w:rPr>
-        <w:t xml:space="preserve">, </w:t>
+      <w:r>
+        <w:rPr>
+          <w:rFonts w:ascii="Barlow" w:eastAsia="Times New Roman" w:hAnsi="Barlow" w:cs="Times New Roman"/>
+          <w:color w:val="000000"/>
+          <w:sz w:val="21"/>
+          <w:szCs w:val="21"/>
+          <w:lang w:val="en-US"/>
+        </w:rPr>
+        <w:t xml:space="preserve">Onshape, </w:t>
       </w:r>
       <w:r>
         <w:rPr>
@@ -3912,29 +3686,7 @@
           <w:szCs w:val="21"/>
           <w:lang w:val="en-US"/>
         </w:rPr>
-        <w:t xml:space="preserve">- Apple &amp; Kode with </w:t>
-      </w:r>
-      <w:proofErr w:type="spellStart"/>
-      <w:r>
-        <w:rPr>
-          <w:rFonts w:ascii="Barlow" w:eastAsia="Times New Roman" w:hAnsi="Barlow" w:cs="Times New Roman"/>
-          <w:color w:val="000000"/>
-          <w:sz w:val="21"/>
-          <w:szCs w:val="21"/>
-          <w:lang w:val="en-US"/>
-        </w:rPr>
-        <w:t>Klossy</w:t>
-      </w:r>
-      <w:proofErr w:type="spellEnd"/>
-      <w:r>
-        <w:rPr>
-          <w:rFonts w:ascii="Barlow" w:eastAsia="Times New Roman" w:hAnsi="Barlow" w:cs="Times New Roman"/>
-          <w:color w:val="000000"/>
-          <w:sz w:val="21"/>
-          <w:szCs w:val="21"/>
-          <w:lang w:val="en-US"/>
-        </w:rPr>
-        <w:t xml:space="preserve"> | New York, NY</w:t>
+        <w:t>- Apple &amp; Kode with Klossy | New York, NY</w:t>
       </w:r>
       <w:r>
         <w:rPr>
@@ -4127,7 +3879,7 @@
 </file>
 
 <file path=word/numbering.xml><?xml version="1.0" encoding="utf-8"?>
-<w:numbering xmlns:wpc="http://schemas.microsoft.com/office/word/2010/wordprocessingCanvas" xmlns:cx="http://schemas.microsoft.com/office/drawing/2014/chartex" xmlns:cx1="http://schemas.microsoft.com/office/drawing/2015/9/8/chartex" xmlns:cx2="http://schemas.microsoft.com/office/drawing/2015/10/21/chartex" xmlns:cx3="http://schemas.microsoft.com/office/drawing/2016/5/9/chartex" xmlns:cx4="http://schemas.microsoft.com/office/drawing/2016/5/10/chartex" xmlns:cx5="http://schemas.microsoft.com/office/drawing/2016/5/11/chartex" xmlns:cx6="http://schemas.microsoft.com/office/drawing/2016/5/12/chartex" xmlns:cx7="http://schemas.microsoft.com/office/drawing/2016/5/13/chartex" xmlns:cx8="http://schemas.microsoft.com/office/drawing/2016/5/14/chartex" xmlns:mc="http://schemas.openxmlformats.org/markup-compatibility/2006" xmlns:aink="http://schemas.microsoft.com/office/drawing/2016/ink" xmlns:am3d="http://schemas.microsoft.com/office/drawing/2017/model3d" xmlns:o="urn:schemas-microsoft-com:office:office" xmlns:oel="http://schemas.microsoft.com/office/2019/extlst" xmlns:r="http://schemas.openxmlformats.org/officeDocument/2006/relationships" xmlns:m="http://schemas.openxmlformats.org/officeDocument/2006/math" xmlns:v="urn:schemas-microsoft-com:vml" xmlns:wp14="http://schemas.microsoft.com/office/word/2010/wordprocessingDrawing" xmlns:wp="http://schemas.openxmlformats.org/drawingml/2006/wordprocessingDrawing" xmlns:w10="urn:schemas-microsoft-com:office:word" xmlns:w="http://schemas.openxmlformats.org/wordprocessingml/2006/main" xmlns:w14="http://schemas.microsoft.com/office/word/2010/wordml" xmlns:w15="http://schemas.microsoft.com/office/word/2012/wordml" xmlns:w16cex="http://schemas.microsoft.com/office/word/2018/wordml/cex" xmlns:w16cid="http://schemas.microsoft.com/office/word/2016/wordml/cid" xmlns:w16="http://schemas.microsoft.com/office/word/2018/wordml" xmlns:w16sdtdh="http://schemas.microsoft.com/office/word/2020/wordml/sdtdatahash" xmlns:w16se="http://schemas.microsoft.com/office/word/2015/wordml/symex" xmlns:wpg="http://schemas.microsoft.com/office/word/2010/wordprocessingGroup" xmlns:wpi="http://schemas.microsoft.com/office/word/2010/wordprocessingInk" xmlns:wne="http://schemas.microsoft.com/office/word/2006/wordml" xmlns:wps="http://schemas.microsoft.com/office/word/2010/wordprocessingShape" mc:Ignorable="w14 w15 w16se w16cid w16 w16cex w16sdtdh wp14">
+<w:numbering xmlns:wpc="http://schemas.microsoft.com/office/word/2010/wordprocessingCanvas" xmlns:cx="http://schemas.microsoft.com/office/drawing/2014/chartex" xmlns:cx1="http://schemas.microsoft.com/office/drawing/2015/9/8/chartex" xmlns:cx2="http://schemas.microsoft.com/office/drawing/2015/10/21/chartex" xmlns:cx3="http://schemas.microsoft.com/office/drawing/2016/5/9/chartex" xmlns:cx4="http://schemas.microsoft.com/office/drawing/2016/5/10/chartex" xmlns:cx5="http://schemas.microsoft.com/office/drawing/2016/5/11/chartex" xmlns:cx6="http://schemas.microsoft.com/office/drawing/2016/5/12/chartex" xmlns:cx7="http://schemas.microsoft.com/office/drawing/2016/5/13/chartex" xmlns:cx8="http://schemas.microsoft.com/office/drawing/2016/5/14/chartex" xmlns:mc="http://schemas.openxmlformats.org/markup-compatibility/2006" xmlns:aink="http://schemas.microsoft.com/office/drawing/2016/ink" xmlns:am3d="http://schemas.microsoft.com/office/drawing/2017/model3d" xmlns:o="urn:schemas-microsoft-com:office:office" xmlns:oel="http://schemas.microsoft.com/office/2019/extlst" xmlns:r="http://schemas.openxmlformats.org/officeDocument/2006/relationships" xmlns:m="http://schemas.openxmlformats.org/officeDocument/2006/math" xmlns:v="urn:schemas-microsoft-com:vml" xmlns:wp14="http://schemas.microsoft.com/office/word/2010/wordprocessingDrawing" xmlns:wp="http://schemas.openxmlformats.org/drawingml/2006/wordprocessingDrawing" xmlns:w10="urn:schemas-microsoft-com:office:word" xmlns:w="http://schemas.openxmlformats.org/wordprocessingml/2006/main" xmlns:w14="http://schemas.microsoft.com/office/word/2010/wordml" xmlns:w15="http://schemas.microsoft.com/office/word/2012/wordml" xmlns:w16cei="http://schemas.microsoft.com/office/word/2026/wordml/cei" xmlns:w16cex="http://schemas.microsoft.com/office/word/2018/wordml/cex" xmlns:w16cid="http://schemas.microsoft.com/office/word/2016/wordml/cid" xmlns:w16="http://schemas.microsoft.com/office/word/2018/wordml" xmlns:w16du="http://schemas.microsoft.com/office/word/2023/wordml/word16du" xmlns:w16sdtdh="http://schemas.microsoft.com/office/word/2020/wordml/sdtdatahash" xmlns:w16sdtfl="http://schemas.microsoft.com/office/word/2024/wordml/sdtformatlock" xmlns:w16se="http://schemas.microsoft.com/office/word/2015/wordml/symex" xmlns:wpg="http://schemas.microsoft.com/office/word/2010/wordprocessingGroup" xmlns:wpi="http://schemas.microsoft.com/office/word/2010/wordprocessingInk" xmlns:wne="http://schemas.microsoft.com/office/word/2006/wordml" xmlns:wps="http://schemas.microsoft.com/office/word/2010/wordprocessingShape" mc:Ignorable="w14 w15 w16se w16cid w16 w16cex w16sdtdh w16sdtfl w16du wp14">
   <w:abstractNum w:abstractNumId="0" w15:restartNumberingAfterBreak="0">
     <w:nsid w:val="00574489"/>
     <w:multiLevelType w:val="multilevel"/>
@@ -6196,7 +5948,7 @@
 </file>
 
 <file path=word/styles.xml><?xml version="1.0" encoding="utf-8"?>
-<w:styles xmlns:mc="http://schemas.openxmlformats.org/markup-compatibility/2006" xmlns:r="http://schemas.openxmlformats.org/officeDocument/2006/relationships" xmlns:w="http://schemas.openxmlformats.org/wordprocessingml/2006/main" xmlns:w14="http://schemas.microsoft.com/office/word/2010/wordml" xmlns:w15="http://schemas.microsoft.com/office/word/2012/wordml" xmlns:w16cex="http://schemas.microsoft.com/office/word/2018/wordml/cex" xmlns:w16cid="http://schemas.microsoft.com/office/word/2016/wordml/cid" xmlns:w16="http://schemas.microsoft.com/office/word/2018/wordml" xmlns:w16sdtdh="http://schemas.microsoft.com/office/word/2020/wordml/sdtdatahash" xmlns:w16se="http://schemas.microsoft.com/office/word/2015/wordml/symex" mc:Ignorable="w14 w15 w16se w16cid w16 w16cex w16sdtdh">
+<w:styles xmlns:mc="http://schemas.openxmlformats.org/markup-compatibility/2006" xmlns:r="http://schemas.openxmlformats.org/officeDocument/2006/relationships" xmlns:w="http://schemas.openxmlformats.org/wordprocessingml/2006/main" xmlns:w14="http://schemas.microsoft.com/office/word/2010/wordml" xmlns:w15="http://schemas.microsoft.com/office/word/2012/wordml" xmlns:w16cex="http://schemas.microsoft.com/office/word/2018/wordml/cex" xmlns:w16cid="http://schemas.microsoft.com/office/word/2016/wordml/cid" xmlns:w16="http://schemas.microsoft.com/office/word/2018/wordml" xmlns:w16du="http://schemas.microsoft.com/office/word/2023/wordml/word16du" xmlns:w16sdtdh="http://schemas.microsoft.com/office/word/2020/wordml/sdtdatahash" xmlns:w16sdtfl="http://schemas.microsoft.com/office/word/2024/wordml/sdtformatlock" xmlns:w16se="http://schemas.microsoft.com/office/word/2015/wordml/symex" mc:Ignorable="w14 w15 w16se w16cid w16 w16cex w16sdtdh w16sdtfl w16du">
   <w:docDefaults>
     <w:rPrDefault>
       <w:rPr>

</xml_diff>

<commit_message>
Update summary for CiC
</commit_message>
<xml_diff>
--- a/public/resume/Monserate Resume.docx
+++ b/public/resume/Monserate Resume.docx
@@ -1,6 +1,6 @@
 
 <file path=word/document.xml><?xml version="1.0" encoding="utf-8"?>
-<w:document xmlns:wpc="http://schemas.microsoft.com/office/word/2010/wordprocessingCanvas" xmlns:cx="http://schemas.microsoft.com/office/drawing/2014/chartex" xmlns:cx1="http://schemas.microsoft.com/office/drawing/2015/9/8/chartex" xmlns:cx2="http://schemas.microsoft.com/office/drawing/2015/10/21/chartex" xmlns:cx3="http://schemas.microsoft.com/office/drawing/2016/5/9/chartex" xmlns:cx4="http://schemas.microsoft.com/office/drawing/2016/5/10/chartex" xmlns:cx5="http://schemas.microsoft.com/office/drawing/2016/5/11/chartex" xmlns:cx6="http://schemas.microsoft.com/office/drawing/2016/5/12/chartex" xmlns:cx7="http://schemas.microsoft.com/office/drawing/2016/5/13/chartex" xmlns:cx8="http://schemas.microsoft.com/office/drawing/2016/5/14/chartex" xmlns:mc="http://schemas.openxmlformats.org/markup-compatibility/2006" xmlns:aink="http://schemas.microsoft.com/office/drawing/2016/ink" xmlns:am3d="http://schemas.microsoft.com/office/drawing/2017/model3d" xmlns:o="urn:schemas-microsoft-com:office:office" xmlns:oel="http://schemas.microsoft.com/office/2019/extlst" xmlns:r="http://schemas.openxmlformats.org/officeDocument/2006/relationships" xmlns:m="http://schemas.openxmlformats.org/officeDocument/2006/math" xmlns:v="urn:schemas-microsoft-com:vml" xmlns:wp14="http://schemas.microsoft.com/office/word/2010/wordprocessingDrawing" xmlns:wp="http://schemas.openxmlformats.org/drawingml/2006/wordprocessingDrawing" xmlns:w10="urn:schemas-microsoft-com:office:word" xmlns:w="http://schemas.openxmlformats.org/wordprocessingml/2006/main" xmlns:w14="http://schemas.microsoft.com/office/word/2010/wordml" xmlns:w15="http://schemas.microsoft.com/office/word/2012/wordml" xmlns:w16cei="http://schemas.microsoft.com/office/word/2026/wordml/cei" xmlns:w16cex="http://schemas.microsoft.com/office/word/2018/wordml/cex" xmlns:w16cid="http://schemas.microsoft.com/office/word/2016/wordml/cid" xmlns:w16="http://schemas.microsoft.com/office/word/2018/wordml" xmlns:w16du="http://schemas.microsoft.com/office/word/2023/wordml/word16du" xmlns:w16sdtdh="http://schemas.microsoft.com/office/word/2020/wordml/sdtdatahash" xmlns:w16sdtfl="http://schemas.microsoft.com/office/word/2024/wordml/sdtformatlock" xmlns:w16se="http://schemas.microsoft.com/office/word/2015/wordml/symex" xmlns:wpg="http://schemas.microsoft.com/office/word/2010/wordprocessingGroup" xmlns:wpi="http://schemas.microsoft.com/office/word/2010/wordprocessingInk" xmlns:wne="http://schemas.microsoft.com/office/word/2006/wordml" xmlns:wps="http://schemas.microsoft.com/office/word/2010/wordprocessingShape" mc:Ignorable="w14 w15 w16se w16cid w16 w16cex w16sdtdh w16sdtfl w16du wp14">
+<w:document xmlns:wpc="http://schemas.microsoft.com/office/word/2010/wordprocessingCanvas" xmlns:cx="http://schemas.microsoft.com/office/drawing/2014/chartex" xmlns:cx1="http://schemas.microsoft.com/office/drawing/2015/9/8/chartex" xmlns:cx2="http://schemas.microsoft.com/office/drawing/2015/10/21/chartex" xmlns:cx3="http://schemas.microsoft.com/office/drawing/2016/5/9/chartex" xmlns:cx4="http://schemas.microsoft.com/office/drawing/2016/5/10/chartex" xmlns:cx5="http://schemas.microsoft.com/office/drawing/2016/5/11/chartex" xmlns:cx6="http://schemas.microsoft.com/office/drawing/2016/5/12/chartex" xmlns:cx7="http://schemas.microsoft.com/office/drawing/2016/5/13/chartex" xmlns:cx8="http://schemas.microsoft.com/office/drawing/2016/5/14/chartex" xmlns:mc="http://schemas.openxmlformats.org/markup-compatibility/2006" xmlns:m="http://schemas.openxmlformats.org/officeDocument/2006/math" xmlns:aink="http://schemas.microsoft.com/office/drawing/2016/ink" xmlns:am3d="http://schemas.microsoft.com/office/drawing/2017/model3d" xmlns:oel="http://schemas.microsoft.com/office/2019/extlst" xmlns:r="http://schemas.openxmlformats.org/officeDocument/2006/relationships" xmlns:wp14="http://schemas.microsoft.com/office/word/2010/wordprocessingDrawing" xmlns:wp="http://schemas.openxmlformats.org/drawingml/2006/wordprocessingDrawing" xmlns:wpg="http://schemas.microsoft.com/office/word/2010/wordprocessingGroup" xmlns:wpi="http://schemas.microsoft.com/office/word/2010/wordprocessingInk" xmlns:wps="http://schemas.microsoft.com/office/word/2010/wordprocessingShape" xmlns:o="urn:schemas-microsoft-com:office:office" xmlns:v="urn:schemas-microsoft-com:vml" xmlns:w10="urn:schemas-microsoft-com:office:word" xmlns:w="http://schemas.openxmlformats.org/wordprocessingml/2006/main" xmlns:w14="http://schemas.microsoft.com/office/word/2010/wordml" xmlns:w15="http://schemas.microsoft.com/office/word/2012/wordml" xmlns:w16cei="http://schemas.microsoft.com/office/word/2026/wordml/cei" xmlns:w16cex="http://schemas.microsoft.com/office/word/2018/wordml/cex" xmlns:w16cid="http://schemas.microsoft.com/office/word/2016/wordml/cid" xmlns:w16="http://schemas.microsoft.com/office/word/2018/wordml" xmlns:w16sdtdh="http://schemas.microsoft.com/office/word/2020/wordml/sdtdatahash" xmlns:w16sdtfl="http://schemas.microsoft.com/office/word/2024/wordml/sdtformatlock" xmlns:w16se="http://schemas.microsoft.com/office/word/2015/wordml/symex" xmlns:w16du="http://schemas.microsoft.com/office/word/2023/wordml/word16du" xmlns:wne="http://schemas.microsoft.com/office/word/2006/wordml" mc:Ignorable="w14 w15 w16se w16cid w16 w16cex w16sdtdh w16sdtfl w16du wp14">
   <w:body>
     <w:p>
       <w:pPr>
@@ -56,29 +56,7 @@
           <w:szCs w:val="21"/>
           <w:lang w:val="en-US"/>
         </w:rPr>
-        <w:t xml:space="preserve">Seattle, WA | violetmonserate@gmail.com </w:t>
-      </w:r>
-      <w:proofErr w:type="gramStart"/>
-      <w:r>
-        <w:rPr>
-          <w:rFonts w:ascii="Barlow" w:eastAsia="Times New Roman" w:hAnsi="Barlow" w:cs="Times New Roman"/>
-          <w:color w:val="000000"/>
-          <w:sz w:val="21"/>
-          <w:szCs w:val="21"/>
-          <w:lang w:val="en-US"/>
-        </w:rPr>
-        <w:t>|  (</w:t>
-      </w:r>
-      <w:proofErr w:type="gramEnd"/>
-      <w:r>
-        <w:rPr>
-          <w:rFonts w:ascii="Barlow" w:eastAsia="Times New Roman" w:hAnsi="Barlow" w:cs="Times New Roman"/>
-          <w:color w:val="000000"/>
-          <w:sz w:val="21"/>
-          <w:szCs w:val="21"/>
-          <w:lang w:val="en-US"/>
-        </w:rPr>
-        <w:t xml:space="preserve">425) 970-5779 |  </w:t>
+        <w:t xml:space="preserve">Seattle, WA | violetmonserate@gmail.com |  (425) 970-5779 |  </w:t>
       </w:r>
       <w:hyperlink r:id="rId5" w:history="1">
         <w:r>
@@ -117,13 +95,14 @@
       <w:r>
         <w:rPr>
           <w:rFonts w:ascii="Barlow" w:eastAsia="Times New Roman" w:hAnsi="Barlow" w:cs="Times New Roman"/>
-          <w:color w:val="000000"/>
-          <w:sz w:val="21"/>
-          <w:szCs w:val="21"/>
-          <w:lang w:val="en-US"/>
-        </w:rPr>
-        <w:pict w14:anchorId="385AA864">
-          <v:rect id="_x0000_i1025" style="width:468pt;height:.75pt" o:hralign="center" o:hrstd="t" o:hr="t" fillcolor="#a0a0a0" stroked="f"/>
+          <w:noProof/>
+          <w:color w:val="000000"/>
+          <w:sz w:val="21"/>
+          <w:szCs w:val="21"/>
+          <w:lang w:val="en-US"/>
+        </w:rPr>
+        <w:pict w14:anchorId="7EC52E82">
+          <v:rect id="_x0000_i1025" alt="" style="width:468pt;height:.05pt;mso-width-percent:0;mso-height-percent:0;mso-width-percent:0;mso-height-percent:0" o:hralign="center" o:hrstd="t" o:hr="t" fillcolor="#a0a0a0" stroked="f"/>
         </w:pict>
       </w:r>
     </w:p>
@@ -608,37 +587,7 @@
           <w:szCs w:val="21"/>
           <w:lang w:val="en-US"/>
         </w:rPr>
-        <w:t>University of Washington-Seattle</w:t>
-      </w:r>
-      <w:r>
-        <w:rPr>
-          <w:rFonts w:ascii="Barlow" w:eastAsia="Times New Roman" w:hAnsi="Barlow" w:cs="Times New Roman"/>
-          <w:color w:val="000000"/>
-          <w:sz w:val="21"/>
-          <w:szCs w:val="21"/>
-          <w:lang w:val="en-US"/>
-        </w:rPr>
-        <w:t xml:space="preserve">, Computer Engineering &amp; </w:t>
-      </w:r>
-      <w:r>
-        <w:rPr>
-          <w:rFonts w:ascii="Barlow" w:eastAsia="Times New Roman" w:hAnsi="Barlow" w:cs="Times New Roman"/>
-          <w:color w:val="000000"/>
-          <w:sz w:val="21"/>
-          <w:szCs w:val="21"/>
-          <w:lang w:val="en-US"/>
-        </w:rPr>
-        <w:t xml:space="preserve">Philosophy: </w:t>
-      </w:r>
-      <w:r>
-        <w:rPr>
-          <w:rFonts w:ascii="Barlow" w:eastAsia="Times New Roman" w:hAnsi="Barlow" w:cs="Times New Roman"/>
-          <w:color w:val="000000"/>
-          <w:sz w:val="21"/>
-          <w:szCs w:val="21"/>
-          <w:lang w:val="en-US"/>
-        </w:rPr>
-        <w:t xml:space="preserve">Ethics | </w:t>
+        <w:t>U</w:t>
       </w:r>
       <w:r>
         <w:rPr>
@@ -650,7 +599,7 @@
           <w:szCs w:val="21"/>
           <w:lang w:val="en-US"/>
         </w:rPr>
-        <w:t>3.9</w:t>
+        <w:t>niversity</w:t>
       </w:r>
       <w:r>
         <w:rPr>
@@ -662,7 +611,7 @@
           <w:szCs w:val="21"/>
           <w:lang w:val="en-US"/>
         </w:rPr>
-        <w:t>7</w:t>
+        <w:t xml:space="preserve"> of Washington, Paul </w:t>
       </w:r>
       <w:r>
         <w:rPr>
@@ -674,7 +623,49 @@
           <w:szCs w:val="21"/>
           <w:lang w:val="en-US"/>
         </w:rPr>
-        <w:t xml:space="preserve"> GPA</w:t>
+        <w:t>G. Allen School</w:t>
+      </w:r>
+      <w:r>
+        <w:rPr>
+          <w:rFonts w:ascii="Barlow" w:eastAsia="Times New Roman" w:hAnsi="Barlow" w:cs="Times New Roman"/>
+          <w:b/>
+          <w:bCs/>
+          <w:color w:val="000000"/>
+          <w:sz w:val="21"/>
+          <w:szCs w:val="21"/>
+          <w:lang w:val="en-US"/>
+        </w:rPr>
+        <w:t xml:space="preserve"> of CSE</w:t>
+      </w:r>
+      <w:r>
+        <w:rPr>
+          <w:rFonts w:ascii="Barlow" w:eastAsia="Times New Roman" w:hAnsi="Barlow" w:cs="Times New Roman"/>
+          <w:color w:val="000000"/>
+          <w:sz w:val="21"/>
+          <w:szCs w:val="21"/>
+          <w:lang w:val="en-US"/>
+        </w:rPr>
+        <w:t xml:space="preserve">, </w:t>
+      </w:r>
+      <w:r>
+        <w:rPr>
+          <w:rFonts w:ascii="Barlow" w:eastAsia="Times New Roman" w:hAnsi="Barlow" w:cs="Times New Roman"/>
+          <w:color w:val="000000"/>
+          <w:sz w:val="21"/>
+          <w:szCs w:val="21"/>
+          <w:lang w:val="en-US"/>
+        </w:rPr>
+        <w:t xml:space="preserve">M.S. in </w:t>
+      </w:r>
+      <w:r>
+        <w:rPr>
+          <w:rFonts w:ascii="Barlow" w:eastAsia="Times New Roman" w:hAnsi="Barlow" w:cs="Times New Roman"/>
+          <w:color w:val="000000"/>
+          <w:sz w:val="21"/>
+          <w:szCs w:val="21"/>
+          <w:lang w:val="en-US"/>
+        </w:rPr>
+        <w:t>Computer Science &amp; Engineering</w:t>
       </w:r>
       <w:r>
         <w:rPr>
@@ -685,27 +676,7 @@
           <w:lang w:val="en-US"/>
         </w:rPr>
         <w:tab/>
-      </w:r>
-      <w:r>
-        <w:rPr>
-          <w:rFonts w:ascii="Barlow" w:eastAsia="Times New Roman" w:hAnsi="Barlow" w:cs="Times New Roman"/>
-          <w:color w:val="000000"/>
-          <w:sz w:val="21"/>
-          <w:szCs w:val="21"/>
-          <w:lang w:val="en-US"/>
-        </w:rPr>
-        <w:tab/>
-        <w:t xml:space="preserve">     </w:t>
-      </w:r>
-      <w:r>
-        <w:rPr>
-          <w:rFonts w:ascii="Barlow" w:eastAsia="Times New Roman" w:hAnsi="Barlow" w:cs="Times New Roman"/>
-          <w:color w:val="000000"/>
-          <w:sz w:val="21"/>
-          <w:szCs w:val="21"/>
-          <w:lang w:val="en-US"/>
-        </w:rPr>
-        <w:t>09</w:t>
+        <w:t xml:space="preserve">Expected </w:t>
       </w:r>
       <w:r>
         <w:rPr>
@@ -717,7 +688,19 @@
           <w:szCs w:val="21"/>
           <w:lang w:val="en-US"/>
         </w:rPr>
-        <w:t>/23 - 06/27</w:t>
+        <w:t>06/2</w:t>
+      </w:r>
+      <w:r>
+        <w:rPr>
+          <w:rFonts w:ascii="Barlow" w:eastAsia="Times New Roman" w:hAnsi="Barlow" w:cs="Times New Roman"/>
+          <w:i/>
+          <w:iCs/>
+          <w:color w:val="000000"/>
+          <w:sz w:val="21"/>
+          <w:szCs w:val="21"/>
+          <w:lang w:val="en-US"/>
+        </w:rPr>
+        <w:t>8</w:t>
       </w:r>
     </w:p>
     <w:p>
@@ -733,6 +716,236 @@
       <w:r>
         <w:rPr>
           <w:rFonts w:ascii="Barlow" w:eastAsia="Times New Roman" w:hAnsi="Barlow" w:cs="Times New Roman"/>
+          <w:b/>
+          <w:bCs/>
+          <w:color w:val="000000"/>
+          <w:sz w:val="21"/>
+          <w:szCs w:val="21"/>
+          <w:lang w:val="en-US"/>
+        </w:rPr>
+        <w:t>University of Washingto</w:t>
+      </w:r>
+      <w:r>
+        <w:rPr>
+          <w:rFonts w:ascii="Barlow" w:eastAsia="Times New Roman" w:hAnsi="Barlow" w:cs="Times New Roman"/>
+          <w:b/>
+          <w:bCs/>
+          <w:color w:val="000000"/>
+          <w:sz w:val="21"/>
+          <w:szCs w:val="21"/>
+          <w:lang w:val="en-US"/>
+        </w:rPr>
+        <w:t>n</w:t>
+      </w:r>
+      <w:r>
+        <w:rPr>
+          <w:rFonts w:ascii="Barlow" w:eastAsia="Times New Roman" w:hAnsi="Barlow" w:cs="Times New Roman"/>
+          <w:color w:val="000000"/>
+          <w:sz w:val="21"/>
+          <w:szCs w:val="21"/>
+          <w:lang w:val="en-US"/>
+        </w:rPr>
+        <w:t xml:space="preserve">, </w:t>
+      </w:r>
+      <w:r>
+        <w:rPr>
+          <w:rFonts w:ascii="Barlow" w:eastAsia="Times New Roman" w:hAnsi="Barlow" w:cs="Times New Roman"/>
+          <w:color w:val="000000"/>
+          <w:sz w:val="21"/>
+          <w:szCs w:val="21"/>
+          <w:lang w:val="en-US"/>
+        </w:rPr>
+        <w:t xml:space="preserve">B.S. in </w:t>
+      </w:r>
+      <w:r>
+        <w:rPr>
+          <w:rFonts w:ascii="Barlow" w:eastAsia="Times New Roman" w:hAnsi="Barlow" w:cs="Times New Roman"/>
+          <w:color w:val="000000"/>
+          <w:sz w:val="21"/>
+          <w:szCs w:val="21"/>
+          <w:lang w:val="en-US"/>
+        </w:rPr>
+        <w:t>Computer Engineering</w:t>
+      </w:r>
+      <w:r>
+        <w:rPr>
+          <w:rFonts w:ascii="Barlow" w:eastAsia="Times New Roman" w:hAnsi="Barlow" w:cs="Times New Roman"/>
+          <w:color w:val="000000"/>
+          <w:sz w:val="21"/>
+          <w:szCs w:val="21"/>
+          <w:lang w:val="en-US"/>
+        </w:rPr>
+        <w:t xml:space="preserve"> </w:t>
+      </w:r>
+      <w:r>
+        <w:rPr>
+          <w:rFonts w:ascii="Barlow" w:eastAsia="Times New Roman" w:hAnsi="Barlow" w:cs="Times New Roman"/>
+          <w:color w:val="000000"/>
+          <w:sz w:val="21"/>
+          <w:szCs w:val="21"/>
+          <w:lang w:val="en-US"/>
+        </w:rPr>
+        <w:t xml:space="preserve">&amp; </w:t>
+      </w:r>
+      <w:r>
+        <w:rPr>
+          <w:rFonts w:ascii="Barlow" w:eastAsia="Times New Roman" w:hAnsi="Barlow" w:cs="Times New Roman"/>
+          <w:color w:val="000000"/>
+          <w:sz w:val="21"/>
+          <w:szCs w:val="21"/>
+          <w:lang w:val="en-US"/>
+        </w:rPr>
+        <w:t>B.A</w:t>
+      </w:r>
+      <w:r>
+        <w:rPr>
+          <w:rFonts w:ascii="Barlow" w:eastAsia="Times New Roman" w:hAnsi="Barlow" w:cs="Times New Roman"/>
+          <w:color w:val="000000"/>
+          <w:sz w:val="21"/>
+          <w:szCs w:val="21"/>
+          <w:lang w:val="en-US"/>
+        </w:rPr>
+        <w:t>.</w:t>
+      </w:r>
+      <w:r>
+        <w:rPr>
+          <w:rFonts w:ascii="Barlow" w:eastAsia="Times New Roman" w:hAnsi="Barlow" w:cs="Times New Roman"/>
+          <w:color w:val="000000"/>
+          <w:sz w:val="21"/>
+          <w:szCs w:val="21"/>
+          <w:lang w:val="en-US"/>
+        </w:rPr>
+        <w:t xml:space="preserve"> in </w:t>
+      </w:r>
+      <w:r>
+        <w:rPr>
+          <w:rFonts w:ascii="Barlow" w:eastAsia="Times New Roman" w:hAnsi="Barlow" w:cs="Times New Roman"/>
+          <w:color w:val="000000"/>
+          <w:sz w:val="21"/>
+          <w:szCs w:val="21"/>
+          <w:lang w:val="en-US"/>
+        </w:rPr>
+        <w:t xml:space="preserve">Philosophy: </w:t>
+      </w:r>
+      <w:r>
+        <w:rPr>
+          <w:rFonts w:ascii="Barlow" w:eastAsia="Times New Roman" w:hAnsi="Barlow" w:cs="Times New Roman"/>
+          <w:color w:val="000000"/>
+          <w:sz w:val="21"/>
+          <w:szCs w:val="21"/>
+          <w:lang w:val="en-US"/>
+        </w:rPr>
+        <w:t xml:space="preserve">Ethics | </w:t>
+      </w:r>
+      <w:r>
+        <w:rPr>
+          <w:rFonts w:ascii="Barlow" w:eastAsia="Times New Roman" w:hAnsi="Barlow" w:cs="Times New Roman"/>
+          <w:b/>
+          <w:bCs/>
+          <w:color w:val="000000"/>
+          <w:sz w:val="21"/>
+          <w:szCs w:val="21"/>
+          <w:lang w:val="en-US"/>
+        </w:rPr>
+        <w:t>3.9</w:t>
+      </w:r>
+      <w:r>
+        <w:rPr>
+          <w:rFonts w:ascii="Barlow" w:eastAsia="Times New Roman" w:hAnsi="Barlow" w:cs="Times New Roman"/>
+          <w:b/>
+          <w:bCs/>
+          <w:color w:val="000000"/>
+          <w:sz w:val="21"/>
+          <w:szCs w:val="21"/>
+          <w:lang w:val="en-US"/>
+        </w:rPr>
+        <w:t>7</w:t>
+      </w:r>
+      <w:r>
+        <w:rPr>
+          <w:rFonts w:ascii="Barlow" w:eastAsia="Times New Roman" w:hAnsi="Barlow" w:cs="Times New Roman"/>
+          <w:b/>
+          <w:bCs/>
+          <w:color w:val="000000"/>
+          <w:sz w:val="21"/>
+          <w:szCs w:val="21"/>
+          <w:lang w:val="en-US"/>
+        </w:rPr>
+        <w:t xml:space="preserve"> GP</w:t>
+      </w:r>
+      <w:r>
+        <w:rPr>
+          <w:rFonts w:ascii="Barlow" w:eastAsia="Times New Roman" w:hAnsi="Barlow" w:cs="Times New Roman"/>
+          <w:b/>
+          <w:bCs/>
+          <w:color w:val="000000"/>
+          <w:sz w:val="21"/>
+          <w:szCs w:val="21"/>
+          <w:lang w:val="en-US"/>
+        </w:rPr>
+        <w:t>A</w:t>
+      </w:r>
+      <w:r>
+        <w:rPr>
+          <w:rFonts w:ascii="Barlow" w:eastAsia="Times New Roman" w:hAnsi="Barlow" w:cs="Times New Roman"/>
+          <w:b/>
+          <w:bCs/>
+          <w:color w:val="000000"/>
+          <w:sz w:val="21"/>
+          <w:szCs w:val="21"/>
+          <w:lang w:val="en-US"/>
+        </w:rPr>
+        <w:tab/>
+      </w:r>
+      <w:r>
+        <w:rPr>
+          <w:rFonts w:ascii="Barlow" w:eastAsia="Times New Roman" w:hAnsi="Barlow" w:cs="Times New Roman"/>
+          <w:b/>
+          <w:bCs/>
+          <w:color w:val="000000"/>
+          <w:sz w:val="21"/>
+          <w:szCs w:val="21"/>
+          <w:lang w:val="en-US"/>
+        </w:rPr>
+        <w:tab/>
+        <w:t xml:space="preserve">     </w:t>
+      </w:r>
+      <w:r>
+        <w:rPr>
+          <w:rFonts w:ascii="Barlow" w:eastAsia="Times New Roman" w:hAnsi="Barlow" w:cs="Times New Roman"/>
+          <w:color w:val="000000"/>
+          <w:sz w:val="21"/>
+          <w:szCs w:val="21"/>
+          <w:lang w:val="en-US"/>
+        </w:rPr>
+        <w:t>09</w:t>
+      </w:r>
+      <w:r>
+        <w:rPr>
+          <w:rFonts w:ascii="Barlow" w:eastAsia="Times New Roman" w:hAnsi="Barlow" w:cs="Times New Roman"/>
+          <w:i/>
+          <w:iCs/>
+          <w:color w:val="000000"/>
+          <w:sz w:val="21"/>
+          <w:szCs w:val="21"/>
+          <w:lang w:val="en-US"/>
+        </w:rPr>
+        <w:t>/23 - 06/27</w:t>
+      </w:r>
+    </w:p>
+    <w:p>
+      <w:pPr>
+        <w:spacing w:line="259" w:lineRule="auto"/>
+        <w:rPr>
+          <w:rFonts w:ascii="Times New Roman" w:eastAsia="Times New Roman" w:hAnsi="Times New Roman" w:cs="Times New Roman"/>
+          <w:sz w:val="24"/>
+          <w:szCs w:val="24"/>
+          <w:lang w:val="en-US"/>
+        </w:rPr>
+      </w:pPr>
+      <w:r>
+        <w:rPr>
+          <w:rFonts w:ascii="Barlow" w:eastAsia="Times New Roman" w:hAnsi="Barlow" w:cs="Times New Roman"/>
           <w:color w:val="000000"/>
           <w:sz w:val="21"/>
           <w:szCs w:val="21"/>
@@ -788,7 +1001,17 @@
           <w:szCs w:val="21"/>
           <w:lang w:val="en-US"/>
         </w:rPr>
-        <w:t>tructures/</w:t>
+        <w:t>tructures</w:t>
+      </w:r>
+      <w:r>
+        <w:rPr>
+          <w:rFonts w:ascii="Barlow" w:eastAsia="Times New Roman" w:hAnsi="Barlow" w:cs="Times New Roman"/>
+          <w:color w:val="000000"/>
+          <w:sz w:val="21"/>
+          <w:szCs w:val="21"/>
+          <w:lang w:val="en-US"/>
+        </w:rPr>
+        <w:t xml:space="preserve">, </w:t>
       </w:r>
       <w:r>
         <w:rPr>
@@ -1327,7 +1550,6 @@
         </w:rPr>
         <w:tab/>
       </w:r>
-      <w:proofErr w:type="gramStart"/>
       <w:r>
         <w:rPr>
           <w:rFonts w:ascii="Barlow" w:eastAsia="Times New Roman" w:hAnsi="Barlow" w:cs="Times New Roman"/>
@@ -1349,20 +1571,7 @@
           <w:szCs w:val="21"/>
           <w:lang w:val="en-US"/>
         </w:rPr>
-        <w:t>09</w:t>
-      </w:r>
-      <w:proofErr w:type="gramEnd"/>
-      <w:r>
-        <w:rPr>
-          <w:rFonts w:ascii="Barlow" w:eastAsia="Times New Roman" w:hAnsi="Barlow" w:cs="Times New Roman"/>
-          <w:i/>
-          <w:iCs/>
-          <w:color w:val="000000"/>
-          <w:sz w:val="21"/>
-          <w:szCs w:val="21"/>
-          <w:lang w:val="en-US"/>
-        </w:rPr>
-        <w:t>/25 - current</w:t>
+        <w:t>09/25 - current</w:t>
       </w:r>
     </w:p>
     <w:p>
@@ -2253,7 +2462,6 @@
         </w:rPr>
         <w:tab/>
       </w:r>
-      <w:proofErr w:type="gramStart"/>
       <w:r>
         <w:rPr>
           <w:rFonts w:ascii="Barlow" w:eastAsia="Times New Roman" w:hAnsi="Barlow" w:cs="Times New Roman"/>
@@ -2275,20 +2483,7 @@
           <w:szCs w:val="21"/>
           <w:lang w:val="en-US"/>
         </w:rPr>
-        <w:t>08</w:t>
-      </w:r>
-      <w:proofErr w:type="gramEnd"/>
-      <w:r>
-        <w:rPr>
-          <w:rFonts w:ascii="Barlow" w:eastAsia="Times New Roman" w:hAnsi="Barlow" w:cs="Times New Roman"/>
-          <w:i/>
-          <w:iCs/>
-          <w:color w:val="000000"/>
-          <w:sz w:val="21"/>
-          <w:szCs w:val="21"/>
-          <w:lang w:val="en-US"/>
-        </w:rPr>
-        <w:t xml:space="preserve">/24 </w:t>
+        <w:t xml:space="preserve">08/24 </w:t>
       </w:r>
       <w:r>
         <w:rPr>
@@ -2731,7 +2926,6 @@
           <w:numId w:val="13"/>
         </w:numPr>
         <w:spacing w:line="259" w:lineRule="auto"/>
-        <w:ind w:left="540"/>
         <w:textAlignment w:val="baseline"/>
         <w:rPr>
           <w:rFonts w:ascii="Barlow" w:eastAsia="Times New Roman" w:hAnsi="Barlow" w:cs="Times New Roman"/>
@@ -2749,157 +2943,134 @@
           <w:szCs w:val="21"/>
           <w:lang w:val="en-US"/>
         </w:rPr>
-        <w:t>D</w:t>
-      </w:r>
-      <w:r>
-        <w:rPr>
-          <w:rFonts w:ascii="Barlow" w:eastAsia="Times New Roman" w:hAnsi="Barlow" w:cs="Times New Roman"/>
-          <w:color w:val="000000"/>
-          <w:sz w:val="21"/>
-          <w:szCs w:val="21"/>
-          <w:lang w:val="en-US"/>
-        </w:rPr>
-        <w:t>evelop</w:t>
-      </w:r>
-      <w:r>
-        <w:rPr>
-          <w:rFonts w:ascii="Barlow" w:eastAsia="Times New Roman" w:hAnsi="Barlow" w:cs="Times New Roman"/>
-          <w:color w:val="000000"/>
-          <w:sz w:val="21"/>
-          <w:szCs w:val="21"/>
-          <w:lang w:val="en-US"/>
-        </w:rPr>
-        <w:t xml:space="preserve"> </w:t>
-      </w:r>
-      <w:r>
-        <w:rPr>
-          <w:rFonts w:ascii="Barlow" w:eastAsia="Times New Roman" w:hAnsi="Barlow" w:cs="Times New Roman"/>
-          <w:color w:val="000000"/>
-          <w:sz w:val="21"/>
-          <w:szCs w:val="21"/>
-          <w:lang w:val="en-US"/>
-        </w:rPr>
-        <w:t xml:space="preserve">and teach </w:t>
-      </w:r>
-      <w:r>
-        <w:rPr>
-          <w:rFonts w:ascii="Barlow" w:eastAsia="Times New Roman" w:hAnsi="Barlow" w:cs="Times New Roman"/>
-          <w:color w:val="000000"/>
-          <w:sz w:val="21"/>
-          <w:szCs w:val="21"/>
-          <w:lang w:val="en-US"/>
-        </w:rPr>
-        <w:t xml:space="preserve">a 4-week </w:t>
-      </w:r>
-      <w:r>
-        <w:rPr>
-          <w:rFonts w:ascii="Barlow" w:eastAsia="Times New Roman" w:hAnsi="Barlow" w:cs="Times New Roman"/>
-          <w:color w:val="000000"/>
-          <w:sz w:val="21"/>
-          <w:szCs w:val="21"/>
-          <w:lang w:val="en-US"/>
-        </w:rPr>
-        <w:t>technical (</w:t>
-      </w:r>
-      <w:r>
-        <w:rPr>
-          <w:rFonts w:ascii="Barlow" w:eastAsia="Times New Roman" w:hAnsi="Barlow" w:cs="Times New Roman"/>
-          <w:color w:val="000000"/>
-          <w:sz w:val="21"/>
-          <w:szCs w:val="21"/>
-          <w:lang w:val="en-US"/>
-        </w:rPr>
-        <w:t>HTML, CSS and Java</w:t>
-      </w:r>
-      <w:r>
-        <w:rPr>
-          <w:rFonts w:ascii="Barlow" w:eastAsia="Times New Roman" w:hAnsi="Barlow" w:cs="Times New Roman"/>
-          <w:color w:val="000000"/>
-          <w:sz w:val="21"/>
-          <w:szCs w:val="21"/>
-          <w:lang w:val="en-US"/>
-        </w:rPr>
-        <w:t>S</w:t>
-      </w:r>
-      <w:r>
-        <w:rPr>
-          <w:rFonts w:ascii="Barlow" w:eastAsia="Times New Roman" w:hAnsi="Barlow" w:cs="Times New Roman"/>
-          <w:color w:val="000000"/>
-          <w:sz w:val="21"/>
-          <w:szCs w:val="21"/>
-          <w:lang w:val="en-US"/>
-        </w:rPr>
-        <w:t>cript</w:t>
-      </w:r>
-      <w:r>
-        <w:rPr>
-          <w:rFonts w:ascii="Barlow" w:eastAsia="Times New Roman" w:hAnsi="Barlow" w:cs="Times New Roman"/>
-          <w:color w:val="000000"/>
-          <w:sz w:val="21"/>
-          <w:szCs w:val="21"/>
-          <w:lang w:val="en-US"/>
-        </w:rPr>
-        <w:t xml:space="preserve">) and </w:t>
-      </w:r>
-      <w:r>
-        <w:rPr>
-          <w:rFonts w:ascii="Barlow" w:eastAsia="Times New Roman" w:hAnsi="Barlow" w:cs="Times New Roman"/>
-          <w:color w:val="000000"/>
-          <w:sz w:val="21"/>
-          <w:szCs w:val="21"/>
-          <w:lang w:val="en-US"/>
-        </w:rPr>
-        <w:t>ethic</w:t>
-      </w:r>
-      <w:r>
-        <w:rPr>
-          <w:rFonts w:ascii="Barlow" w:eastAsia="Times New Roman" w:hAnsi="Barlow" w:cs="Times New Roman"/>
-          <w:color w:val="000000"/>
-          <w:sz w:val="21"/>
-          <w:szCs w:val="21"/>
-          <w:lang w:val="en-US"/>
-        </w:rPr>
-        <w:t xml:space="preserve">al curriculum </w:t>
-      </w:r>
-      <w:r>
-        <w:rPr>
-          <w:rFonts w:ascii="Barlow" w:eastAsia="Times New Roman" w:hAnsi="Barlow" w:cs="Times New Roman"/>
-          <w:color w:val="000000"/>
-          <w:sz w:val="21"/>
-          <w:szCs w:val="21"/>
-          <w:lang w:val="en-US"/>
-        </w:rPr>
-        <w:t xml:space="preserve">to a group of </w:t>
-      </w:r>
-      <w:r>
-        <w:rPr>
-          <w:rFonts w:ascii="Barlow" w:eastAsia="Times New Roman" w:hAnsi="Barlow" w:cs="Times New Roman"/>
-          <w:color w:val="000000"/>
-          <w:sz w:val="21"/>
-          <w:szCs w:val="21"/>
-          <w:lang w:val="en-US"/>
-        </w:rPr>
-        <w:t>~</w:t>
-      </w:r>
-      <w:r>
-        <w:rPr>
-          <w:rFonts w:ascii="Barlow" w:eastAsia="Times New Roman" w:hAnsi="Barlow" w:cs="Times New Roman"/>
-          <w:color w:val="000000"/>
-          <w:sz w:val="21"/>
-          <w:szCs w:val="21"/>
-          <w:lang w:val="en-US"/>
-        </w:rPr>
-        <w:t>40 high school students</w:t>
-      </w:r>
-      <w:r>
-        <w:rPr>
-          <w:rFonts w:ascii="Barlow" w:eastAsia="Times New Roman" w:hAnsi="Barlow" w:cs="Times New Roman"/>
-          <w:color w:val="000000"/>
-          <w:sz w:val="21"/>
-          <w:szCs w:val="21"/>
-          <w:lang w:val="en-US"/>
-        </w:rPr>
-        <w:t xml:space="preserve"> from underrepresented backgrounds</w:t>
+        <w:t>Direct program operations and train new mentors</w:t>
+      </w:r>
+      <w:r>
+        <w:rPr>
+          <w:rFonts w:ascii="Barlow" w:eastAsia="Times New Roman" w:hAnsi="Barlow" w:cs="Times New Roman"/>
+          <w:color w:val="000000"/>
+          <w:sz w:val="21"/>
+          <w:szCs w:val="21"/>
+          <w:lang w:val="en-US"/>
+        </w:rPr>
+        <w:t xml:space="preserve"> through </w:t>
+      </w:r>
+      <w:r>
+        <w:rPr>
+          <w:rFonts w:ascii="Barlow" w:eastAsia="Times New Roman" w:hAnsi="Barlow" w:cs="Times New Roman"/>
+          <w:color w:val="000000"/>
+          <w:sz w:val="21"/>
+          <w:szCs w:val="21"/>
+          <w:lang w:val="en-US"/>
+        </w:rPr>
+        <w:t>task delegation and staff onboardin</w:t>
+      </w:r>
+      <w:r>
+        <w:rPr>
+          <w:rFonts w:ascii="Barlow" w:eastAsia="Times New Roman" w:hAnsi="Barlow" w:cs="Times New Roman"/>
+          <w:color w:val="000000"/>
+          <w:sz w:val="21"/>
+          <w:szCs w:val="21"/>
+          <w:lang w:val="en-US"/>
+        </w:rPr>
+        <w:t>g</w:t>
+      </w:r>
+    </w:p>
+    <w:p>
+      <w:pPr>
+        <w:numPr>
+          <w:ilvl w:val="0"/>
+          <w:numId w:val="13"/>
+        </w:numPr>
+        <w:spacing w:line="259" w:lineRule="auto"/>
+        <w:textAlignment w:val="baseline"/>
+        <w:rPr>
+          <w:rFonts w:ascii="Barlow" w:eastAsia="Times New Roman" w:hAnsi="Barlow" w:cs="Times New Roman"/>
+          <w:color w:val="000000"/>
+          <w:sz w:val="21"/>
+          <w:szCs w:val="21"/>
+          <w:lang w:val="en-US"/>
+        </w:rPr>
+      </w:pPr>
+      <w:r>
+        <w:rPr>
+          <w:rFonts w:ascii="Barlow" w:eastAsia="Times New Roman" w:hAnsi="Barlow" w:cs="Times New Roman"/>
+          <w:color w:val="000000"/>
+          <w:sz w:val="21"/>
+          <w:szCs w:val="21"/>
+          <w:lang w:val="en-US"/>
+        </w:rPr>
+        <w:t xml:space="preserve">Spearhead </w:t>
+      </w:r>
+      <w:r>
+        <w:rPr>
+          <w:rFonts w:ascii="Barlow" w:eastAsia="Times New Roman" w:hAnsi="Barlow" w:cs="Times New Roman"/>
+          <w:color w:val="000000"/>
+          <w:sz w:val="21"/>
+          <w:szCs w:val="21"/>
+          <w:lang w:val="en-US"/>
+        </w:rPr>
+        <w:t xml:space="preserve">web </w:t>
+      </w:r>
+      <w:r>
+        <w:rPr>
+          <w:rFonts w:ascii="Barlow" w:eastAsia="Times New Roman" w:hAnsi="Barlow" w:cs="Times New Roman"/>
+          <w:color w:val="000000"/>
+          <w:sz w:val="21"/>
+          <w:szCs w:val="21"/>
+          <w:lang w:val="en-US"/>
+        </w:rPr>
+        <w:t>dev</w:t>
+      </w:r>
+      <w:r>
+        <w:rPr>
+          <w:rFonts w:ascii="Barlow" w:eastAsia="Times New Roman" w:hAnsi="Barlow" w:cs="Times New Roman"/>
+          <w:color w:val="000000"/>
+          <w:sz w:val="21"/>
+          <w:szCs w:val="21"/>
+          <w:lang w:val="en-US"/>
+        </w:rPr>
+        <w:t xml:space="preserve"> and tech </w:t>
+      </w:r>
+      <w:r>
+        <w:rPr>
+          <w:rFonts w:ascii="Barlow" w:eastAsia="Times New Roman" w:hAnsi="Barlow" w:cs="Times New Roman"/>
+          <w:color w:val="000000"/>
+          <w:sz w:val="21"/>
+          <w:szCs w:val="21"/>
+          <w:lang w:val="en-US"/>
+        </w:rPr>
+        <w:t>ethics</w:t>
+      </w:r>
+      <w:r>
+        <w:rPr>
+          <w:rFonts w:ascii="Barlow" w:eastAsia="Times New Roman" w:hAnsi="Barlow" w:cs="Times New Roman"/>
+          <w:color w:val="000000"/>
+          <w:sz w:val="21"/>
+          <w:szCs w:val="21"/>
+          <w:lang w:val="en-US"/>
+        </w:rPr>
+        <w:t xml:space="preserve"> curriculum for 40 students</w:t>
+      </w:r>
+      <w:r>
+        <w:rPr>
+          <w:rFonts w:ascii="Barlow" w:eastAsia="Times New Roman" w:hAnsi="Barlow" w:cs="Times New Roman"/>
+          <w:color w:val="000000"/>
+          <w:sz w:val="21"/>
+          <w:szCs w:val="21"/>
+          <w:lang w:val="en-US"/>
+        </w:rPr>
+        <w:t xml:space="preserve">, leading to </w:t>
+      </w:r>
+      <w:r>
+        <w:rPr>
+          <w:rFonts w:ascii="Barlow" w:eastAsia="Times New Roman" w:hAnsi="Barlow" w:cs="Times New Roman"/>
+          <w:color w:val="000000"/>
+          <w:sz w:val="21"/>
+          <w:szCs w:val="21"/>
+          <w:lang w:val="en-US"/>
+        </w:rPr>
+        <w:t>97% program recommendation rate</w:t>
       </w:r>
     </w:p>
     <w:p>
@@ -3879,7 +4050,7 @@
 </file>
 
 <file path=word/numbering.xml><?xml version="1.0" encoding="utf-8"?>
-<w:numbering xmlns:wpc="http://schemas.microsoft.com/office/word/2010/wordprocessingCanvas" xmlns:cx="http://schemas.microsoft.com/office/drawing/2014/chartex" xmlns:cx1="http://schemas.microsoft.com/office/drawing/2015/9/8/chartex" xmlns:cx2="http://schemas.microsoft.com/office/drawing/2015/10/21/chartex" xmlns:cx3="http://schemas.microsoft.com/office/drawing/2016/5/9/chartex" xmlns:cx4="http://schemas.microsoft.com/office/drawing/2016/5/10/chartex" xmlns:cx5="http://schemas.microsoft.com/office/drawing/2016/5/11/chartex" xmlns:cx6="http://schemas.microsoft.com/office/drawing/2016/5/12/chartex" xmlns:cx7="http://schemas.microsoft.com/office/drawing/2016/5/13/chartex" xmlns:cx8="http://schemas.microsoft.com/office/drawing/2016/5/14/chartex" xmlns:mc="http://schemas.openxmlformats.org/markup-compatibility/2006" xmlns:aink="http://schemas.microsoft.com/office/drawing/2016/ink" xmlns:am3d="http://schemas.microsoft.com/office/drawing/2017/model3d" xmlns:o="urn:schemas-microsoft-com:office:office" xmlns:oel="http://schemas.microsoft.com/office/2019/extlst" xmlns:r="http://schemas.openxmlformats.org/officeDocument/2006/relationships" xmlns:m="http://schemas.openxmlformats.org/officeDocument/2006/math" xmlns:v="urn:schemas-microsoft-com:vml" xmlns:wp14="http://schemas.microsoft.com/office/word/2010/wordprocessingDrawing" xmlns:wp="http://schemas.openxmlformats.org/drawingml/2006/wordprocessingDrawing" xmlns:w10="urn:schemas-microsoft-com:office:word" xmlns:w="http://schemas.openxmlformats.org/wordprocessingml/2006/main" xmlns:w14="http://schemas.microsoft.com/office/word/2010/wordml" xmlns:w15="http://schemas.microsoft.com/office/word/2012/wordml" xmlns:w16cei="http://schemas.microsoft.com/office/word/2026/wordml/cei" xmlns:w16cex="http://schemas.microsoft.com/office/word/2018/wordml/cex" xmlns:w16cid="http://schemas.microsoft.com/office/word/2016/wordml/cid" xmlns:w16="http://schemas.microsoft.com/office/word/2018/wordml" xmlns:w16du="http://schemas.microsoft.com/office/word/2023/wordml/word16du" xmlns:w16sdtdh="http://schemas.microsoft.com/office/word/2020/wordml/sdtdatahash" xmlns:w16sdtfl="http://schemas.microsoft.com/office/word/2024/wordml/sdtformatlock" xmlns:w16se="http://schemas.microsoft.com/office/word/2015/wordml/symex" xmlns:wpg="http://schemas.microsoft.com/office/word/2010/wordprocessingGroup" xmlns:wpi="http://schemas.microsoft.com/office/word/2010/wordprocessingInk" xmlns:wne="http://schemas.microsoft.com/office/word/2006/wordml" xmlns:wps="http://schemas.microsoft.com/office/word/2010/wordprocessingShape" mc:Ignorable="w14 w15 w16se w16cid w16 w16cex w16sdtdh w16sdtfl w16du wp14">
+<w:numbering xmlns:wpc="http://schemas.microsoft.com/office/word/2010/wordprocessingCanvas" xmlns:cx="http://schemas.microsoft.com/office/drawing/2014/chartex" xmlns:cx1="http://schemas.microsoft.com/office/drawing/2015/9/8/chartex" xmlns:cx2="http://schemas.microsoft.com/office/drawing/2015/10/21/chartex" xmlns:cx3="http://schemas.microsoft.com/office/drawing/2016/5/9/chartex" xmlns:cx4="http://schemas.microsoft.com/office/drawing/2016/5/10/chartex" xmlns:cx5="http://schemas.microsoft.com/office/drawing/2016/5/11/chartex" xmlns:cx6="http://schemas.microsoft.com/office/drawing/2016/5/12/chartex" xmlns:cx7="http://schemas.microsoft.com/office/drawing/2016/5/13/chartex" xmlns:cx8="http://schemas.microsoft.com/office/drawing/2016/5/14/chartex" xmlns:mc="http://schemas.openxmlformats.org/markup-compatibility/2006" xmlns:m="http://schemas.openxmlformats.org/officeDocument/2006/math" xmlns:aink="http://schemas.microsoft.com/office/drawing/2016/ink" xmlns:am3d="http://schemas.microsoft.com/office/drawing/2017/model3d" xmlns:oel="http://schemas.microsoft.com/office/2019/extlst" xmlns:r="http://schemas.openxmlformats.org/officeDocument/2006/relationships" xmlns:wp14="http://schemas.microsoft.com/office/word/2010/wordprocessingDrawing" xmlns:wp="http://schemas.openxmlformats.org/drawingml/2006/wordprocessingDrawing" xmlns:wpg="http://schemas.microsoft.com/office/word/2010/wordprocessingGroup" xmlns:wpi="http://schemas.microsoft.com/office/word/2010/wordprocessingInk" xmlns:wps="http://schemas.microsoft.com/office/word/2010/wordprocessingShape" xmlns:o="urn:schemas-microsoft-com:office:office" xmlns:v="urn:schemas-microsoft-com:vml" xmlns:w10="urn:schemas-microsoft-com:office:word" xmlns:w="http://schemas.openxmlformats.org/wordprocessingml/2006/main" xmlns:w14="http://schemas.microsoft.com/office/word/2010/wordml" xmlns:w15="http://schemas.microsoft.com/office/word/2012/wordml" xmlns:w16cei="http://schemas.microsoft.com/office/word/2026/wordml/cei" xmlns:w16cex="http://schemas.microsoft.com/office/word/2018/wordml/cex" xmlns:w16cid="http://schemas.microsoft.com/office/word/2016/wordml/cid" xmlns:w16="http://schemas.microsoft.com/office/word/2018/wordml" xmlns:w16sdtdh="http://schemas.microsoft.com/office/word/2020/wordml/sdtdatahash" xmlns:w16sdtfl="http://schemas.microsoft.com/office/word/2024/wordml/sdtformatlock" xmlns:w16se="http://schemas.microsoft.com/office/word/2015/wordml/symex" xmlns:w16du="http://schemas.microsoft.com/office/word/2023/wordml/word16du" xmlns:wne="http://schemas.microsoft.com/office/word/2006/wordml" mc:Ignorable="w14 w15 w16se w16cid w16 w16cex w16sdtdh w16sdtfl w16du wp14">
   <w:abstractNum w:abstractNumId="0" w15:restartNumberingAfterBreak="0">
     <w:nsid w:val="00574489"/>
     <w:multiLevelType w:val="multilevel"/>
@@ -5761,9 +5932,9 @@
       <w:lvlJc w:val="left"/>
       <w:pPr>
         <w:tabs>
-          <w:tab w:val="num" w:pos="720"/>
-        </w:tabs>
-        <w:ind w:left="720" w:hanging="360"/>
+          <w:tab w:val="num" w:pos="540"/>
+        </w:tabs>
+        <w:ind w:left="540" w:hanging="360"/>
       </w:pPr>
       <w:rPr>
         <w:rFonts w:ascii="Symbol" w:hAnsi="Symbol" w:hint="default"/>
@@ -5777,9 +5948,9 @@
       <w:lvlJc w:val="left"/>
       <w:pPr>
         <w:tabs>
-          <w:tab w:val="num" w:pos="1440"/>
-        </w:tabs>
-        <w:ind w:left="1440" w:hanging="360"/>
+          <w:tab w:val="num" w:pos="1260"/>
+        </w:tabs>
+        <w:ind w:left="1260" w:hanging="360"/>
       </w:pPr>
       <w:rPr>
         <w:rFonts w:ascii="Courier New" w:hAnsi="Courier New" w:hint="default"/>
@@ -5793,9 +5964,9 @@
       <w:lvlJc w:val="left"/>
       <w:pPr>
         <w:tabs>
-          <w:tab w:val="num" w:pos="2160"/>
-        </w:tabs>
-        <w:ind w:left="2160" w:hanging="360"/>
+          <w:tab w:val="num" w:pos="1980"/>
+        </w:tabs>
+        <w:ind w:left="1980" w:hanging="360"/>
       </w:pPr>
       <w:rPr>
         <w:rFonts w:ascii="Wingdings" w:hAnsi="Wingdings" w:hint="default"/>
@@ -5809,9 +5980,9 @@
       <w:lvlJc w:val="left"/>
       <w:pPr>
         <w:tabs>
-          <w:tab w:val="num" w:pos="2880"/>
-        </w:tabs>
-        <w:ind w:left="2880" w:hanging="360"/>
+          <w:tab w:val="num" w:pos="2700"/>
+        </w:tabs>
+        <w:ind w:left="2700" w:hanging="360"/>
       </w:pPr>
       <w:rPr>
         <w:rFonts w:ascii="Wingdings" w:hAnsi="Wingdings" w:hint="default"/>
@@ -5825,9 +5996,9 @@
       <w:lvlJc w:val="left"/>
       <w:pPr>
         <w:tabs>
-          <w:tab w:val="num" w:pos="3600"/>
-        </w:tabs>
-        <w:ind w:left="3600" w:hanging="360"/>
+          <w:tab w:val="num" w:pos="3420"/>
+        </w:tabs>
+        <w:ind w:left="3420" w:hanging="360"/>
       </w:pPr>
       <w:rPr>
         <w:rFonts w:ascii="Wingdings" w:hAnsi="Wingdings" w:hint="default"/>
@@ -5841,9 +6012,9 @@
       <w:lvlJc w:val="left"/>
       <w:pPr>
         <w:tabs>
-          <w:tab w:val="num" w:pos="4320"/>
-        </w:tabs>
-        <w:ind w:left="4320" w:hanging="360"/>
+          <w:tab w:val="num" w:pos="4140"/>
+        </w:tabs>
+        <w:ind w:left="4140" w:hanging="360"/>
       </w:pPr>
       <w:rPr>
         <w:rFonts w:ascii="Wingdings" w:hAnsi="Wingdings" w:hint="default"/>
@@ -5857,9 +6028,9 @@
       <w:lvlJc w:val="left"/>
       <w:pPr>
         <w:tabs>
-          <w:tab w:val="num" w:pos="5040"/>
-        </w:tabs>
-        <w:ind w:left="5040" w:hanging="360"/>
+          <w:tab w:val="num" w:pos="4860"/>
+        </w:tabs>
+        <w:ind w:left="4860" w:hanging="360"/>
       </w:pPr>
       <w:rPr>
         <w:rFonts w:ascii="Wingdings" w:hAnsi="Wingdings" w:hint="default"/>
@@ -5873,9 +6044,9 @@
       <w:lvlJc w:val="left"/>
       <w:pPr>
         <w:tabs>
-          <w:tab w:val="num" w:pos="5760"/>
-        </w:tabs>
-        <w:ind w:left="5760" w:hanging="360"/>
+          <w:tab w:val="num" w:pos="5580"/>
+        </w:tabs>
+        <w:ind w:left="5580" w:hanging="360"/>
       </w:pPr>
       <w:rPr>
         <w:rFonts w:ascii="Wingdings" w:hAnsi="Wingdings" w:hint="default"/>
@@ -5889,9 +6060,9 @@
       <w:lvlJc w:val="left"/>
       <w:pPr>
         <w:tabs>
-          <w:tab w:val="num" w:pos="6480"/>
-        </w:tabs>
-        <w:ind w:left="6480" w:hanging="360"/>
+          <w:tab w:val="num" w:pos="6300"/>
+        </w:tabs>
+        <w:ind w:left="6300" w:hanging="360"/>
       </w:pPr>
       <w:rPr>
         <w:rFonts w:ascii="Wingdings" w:hAnsi="Wingdings" w:hint="default"/>
@@ -5948,7 +6119,7 @@
 </file>
 
 <file path=word/styles.xml><?xml version="1.0" encoding="utf-8"?>
-<w:styles xmlns:mc="http://schemas.openxmlformats.org/markup-compatibility/2006" xmlns:r="http://schemas.openxmlformats.org/officeDocument/2006/relationships" xmlns:w="http://schemas.openxmlformats.org/wordprocessingml/2006/main" xmlns:w14="http://schemas.microsoft.com/office/word/2010/wordml" xmlns:w15="http://schemas.microsoft.com/office/word/2012/wordml" xmlns:w16cex="http://schemas.microsoft.com/office/word/2018/wordml/cex" xmlns:w16cid="http://schemas.microsoft.com/office/word/2016/wordml/cid" xmlns:w16="http://schemas.microsoft.com/office/word/2018/wordml" xmlns:w16du="http://schemas.microsoft.com/office/word/2023/wordml/word16du" xmlns:w16sdtdh="http://schemas.microsoft.com/office/word/2020/wordml/sdtdatahash" xmlns:w16sdtfl="http://schemas.microsoft.com/office/word/2024/wordml/sdtformatlock" xmlns:w16se="http://schemas.microsoft.com/office/word/2015/wordml/symex" mc:Ignorable="w14 w15 w16se w16cid w16 w16cex w16sdtdh w16sdtfl w16du">
+<w:styles xmlns:mc="http://schemas.openxmlformats.org/markup-compatibility/2006" xmlns:r="http://schemas.openxmlformats.org/officeDocument/2006/relationships" xmlns:w="http://schemas.openxmlformats.org/wordprocessingml/2006/main" xmlns:w14="http://schemas.microsoft.com/office/word/2010/wordml" xmlns:w15="http://schemas.microsoft.com/office/word/2012/wordml" xmlns:w16cex="http://schemas.microsoft.com/office/word/2018/wordml/cex" xmlns:w16cid="http://schemas.microsoft.com/office/word/2016/wordml/cid" xmlns:w16="http://schemas.microsoft.com/office/word/2018/wordml" xmlns:w16sdtdh="http://schemas.microsoft.com/office/word/2020/wordml/sdtdatahash" xmlns:w16sdtfl="http://schemas.microsoft.com/office/word/2024/wordml/sdtformatlock" xmlns:w16se="http://schemas.microsoft.com/office/word/2015/wordml/symex" xmlns:w16du="http://schemas.microsoft.com/office/word/2023/wordml/word16du" mc:Ignorable="w14 w15 w16se w16cid w16 w16cex w16sdtdh w16sdtfl w16du">
   <w:docDefaults>
     <w:rPrDefault>
       <w:rPr>
@@ -6463,6 +6634,7 @@
   <w:style w:type="character" w:default="1" w:styleId="DefaultParagraphFont">
     <w:name w:val="Default Paragraph Font"/>
     <w:uiPriority w:val="1"/>
+    <w:semiHidden/>
     <w:unhideWhenUsed/>
   </w:style>
   <w:style w:type="table" w:default="1" w:styleId="TableNormal">

</xml_diff>